<commit_message>
feat(arm-education): blind peer review emulado e correções de submissão (R422)
- Review com 3 revisores (R1 painel, R2 educação, R3 método): 12 achados,
  0 bloqueios; verificação aritmética exaustiva confirmou a cadeia de números
- Corrigidos 8 achados no MD/TeX/PDF/DOCX:
  * RBEP = Revista Brasileira de Estudos Pedagógicos (glossário A.3)
  * Introdução: "validações cruzadas por país e a análises de subperíodos"
  * 4.8: ressalva demográfica da matrícula bruta
  * Tabela 10: rótulo oficial WDI completo (Afeganistão e Paquistão)
  * Nova seção Declarações (conflito, financiamento, dados/código)
  * Nota de arredondamento Δ (0,7508 − 0,1465 = 0,6043)
  * Proveniência 4.7 também aponta para channels/provenance_r413.json
  * Datas download 13/08 + verificação API 14/08 explicitadas
- Relatório consolidado: outputs/review/peer_review_r422.md
- Testes R422 (17); suíte R408-R422 com 351 passed
- EvolutionRegistry: R422 (240 ciclos); evo-53 documentado
</commit_message>
<xml_diff>
--- a/academic/papers/arm_education_audit/outputs/docx/ARTIGO_RBEP_SUBMISSAO.docx
+++ b/academic/papers/arm_education_audit/outputs/docx/ARTIGO_RBEP_SUBMISSAO.docx
@@ -28,7 +28,7 @@
         </w:p>
       </w:sdtContent>
     </w:sdt>
-    <w:bookmarkStart w:id="37" w:name="X7264fb5a8c1f10fb3110502e6c193bad8ce706a"/>
+    <w:bookmarkStart w:id="38" w:name="X7264fb5a8c1f10fb3110502e6c193bad8ce706a"/>
     <w:p>
       <w:pPr>
         <w:pStyle w:val="Heading1"/>
@@ -252,7 +252,7 @@
         <w:pStyle w:val="BodyText"/>
       </w:pPr>
       <w:r>
-        <w:t xml:space="preserve">Este artigo contribui com um exercício empírico transparente e auditável: a partir de dados oficiais do Banco Mundial, examinamos a associação entre matrícula terciária bruta, gasto educacional, dispêndio em pesquisa e desenvolvimento e indicadores de governança, de um lado, e nível de renda per capita, de outro, em um painel de 135 economias ao longo de 64 anos. A contribuição não é a novidade metodológica, mas o rigor de reprodutibilidade e a amplitude da amostra: toda a cadeia de dados, código e resultados está disponível, as inferências são submetidas a validações cruzadas por país e por tempo, e os erros padrão são robustos à correlação serial por país.</w:t>
+        <w:t xml:space="preserve">Este artigo contribui com um exercício empírico transparente e auditável: a partir de dados oficiais do Banco Mundial, examinamos a associação entre matrícula terciária bruta, gasto educacional, dispêndio em pesquisa e desenvolvimento e indicadores de governança, de um lado, e nível de renda per capita, de outro, em um painel de 135 economias ao longo de 64 anos. A contribuição não é a novidade metodológica, mas o rigor de reprodutibilidade e a amplitude da amostra: toda a cadeia de dados, código e resultados está disponível, as inferências são submetidas a validações cruzadas por país e a análises de subperíodos, e os erros padrão são robustos à correlação serial por país.</w:t>
       </w:r>
     </w:p>
     <w:p>
@@ -376,7 +376,7 @@
         <w:pStyle w:val="FirstParagraph"/>
       </w:pPr>
       <w:r>
-        <w:t xml:space="preserve">Os dados provêm da API do World Development Indicators e do Worldwide Governance Indicators do Banco Mundial (WORLD BANK, 2024; KAUFMANN; KRAAY; MASTRUZZI, 2011), com download em 13 de agosto de 2026 e cache local imutável (URL, timestamp UTC, status HTTP e hash SHA-256 de cada arquivo em</w:t>
+        <w:t xml:space="preserve">Os dados provêm da API do World Development Indicators e do Worldwide Governance Indicators do Banco Mundial (WORLD BANK, 2024; KAUFMANN; KRAAY; MASTRUZZI, 2011), com download em 13 de agosto de 2026 (verificação contra a API em 14 de agosto de 2026) e cache local imutável (URL, timestamp UTC, status HTTP e hash SHA-256 de cada arquivo em</w:t>
       </w:r>
       <w:r>
         <w:t xml:space="preserve"> </w:t>
@@ -574,7 +574,19 @@
         <w:t xml:space="preserve">outputs/expanded/provenance_expanded.json</w:t>
       </w:r>
       <w:r>
-        <w:t xml:space="preserve">). Cada número citado neste artigo tem entrada correspondente nesse arquivo. A execução é offline e determinística (sementes fixas).</w:t>
+        <w:t xml:space="preserve">). Cada número citado neste artigo tem entrada correspondente nesse arquivo; os números dos canais associativos (seção 4.7) residem em</w:t>
+      </w:r>
+      <w:r>
+        <w:t xml:space="preserve"> </w:t>
+      </w:r>
+      <w:r>
+        <w:rPr>
+          <w:rStyle w:val="VerbatimChar"/>
+        </w:rPr>
+        <w:t xml:space="preserve">outputs/channels/provenance_r413.json</w:t>
+      </w:r>
+      <w:r>
+        <w:t xml:space="preserve">. A execução é offline e determinística (sementes fixas).</w:t>
       </w:r>
     </w:p>
     <w:bookmarkEnd w:id="16"/>
@@ -3064,7 +3076,7 @@
         <w:pStyle w:val="BodyText"/>
       </w:pPr>
       <w:r>
-        <w:t xml:space="preserve">Na década observada, o Brasil elevou a matrícula terciária de 43,834% para 61,000%, um acréscimo de 17,166 pontos percentuais, em um contexto de PIB per capita aproximadamente estacionário (−0,149% ao ano). O contraste com a China é o mais pronunciado: o país asiático partiu de um patamar inferior ao brasileiro (29,308%) e alcançou 71,580% (+42,272 p.p.), com crescimento econômico de 5,814% ao ano. A comparação com os vizinhos latino-americanos é igualmente reveladora. A Argentina iniciou o período com matrícula já elevada (78,147%) e atingiu 107,104% em 2022 — valor acima de 100%, característico de matrícula bruta que incorpora alunos fora da faixa etária típica —, com expansão de 28,957 p.p. e PIB per capita em leve declínio (−0,353% ao ano). O México partiu de 29,350%, patamar semelhante ao chinês e inferior ao brasileiro, e alcançou 46,406% (+17,056 p.p.), com crescimento econômico modesto (0,233% ao ano). Entre os grupos de referência, a Europa Ocidental avançou +13,199 p.p. (1,063% ao ano) e a renda média asiática +13,455 p.p. (3,579% ao ano), enquanto os Estados Unidos registraram declínio (−9,364 p.p.), evidenciando a heterogeneidade das trajetórias mesmo entre economias de alta renda.</w:t>
+        <w:t xml:space="preserve">Na década observada, o Brasil elevou a matrícula terciária de 43,834% para 61,000%, um acréscimo de 17,166 pontos percentuais, em um contexto de PIB per capita aproximadamente estacionário (−0,149% ao ano). O contraste com a China é o mais pronunciado: o país asiático partiu de um patamar inferior ao brasileiro (29,308%) e alcançou 71,580% (+42,272 p.p.), com crescimento econômico de 5,814% ao ano. A comparação com os vizinhos latino-americanos é igualmente reveladora. A Argentina iniciou o período com matrícula já elevada (78,147%) e atingiu 107,104% em 2022 — valor acima de 100%, característico de matrícula bruta que incorpora alunos fora da faixa etária típica —, com expansão de 28,957 p.p. e PIB per capita em leve declínio (−0,353% ao ano). Vale notar que a matrícula bruta não é corrigida pela composição etária da população: comparar níveis brutos entre países com demografias distintas (como a Argentina, com 107,1%, e economias de população mais jovem) exige cautela adicional, pois parte da diferença pode refletir estrutura etária e não apenas política educacional. O México partiu de 29,350%, patamar semelhante ao chinês e inferior ao brasileiro, e alcançou 46,406% (+17,056 p.p.), com crescimento econômico modesto (0,233% ao ano). Entre os grupos de referência, a Europa Ocidental avançou +13,199 p.p. (1,063% ao ano) e a renda média asiática +13,455 p.p. (3,579% ao ano), enquanto os Estados Unidos registraram declínio (−9,364 p.p.), evidenciando a heterogeneidade das trajetórias mesmo entre economias de alta renda.</w:t>
       </w:r>
     </w:p>
     <w:p>
@@ -3090,7 +3102,7 @@
         <w:pStyle w:val="FirstParagraph"/>
       </w:pPr>
       <w:r>
-        <w:t xml:space="preserve">A hipótese central deste estudo — a associação matrícula terciária × renda é forte entre países (níveis) e fraca dentro do país (primeiras diferenças) — é avaliada formalmente. Formulada como H0: ρ_níveis − ρ_primeiras diferenças ≤ 0 contra H1: ρ_níveis − ρ_primeiras diferenças &gt; 0, a hipótese é testada por bootstrap por país: os 135 países são re-amostrados com reposição (500 replicações, semente fixa) e as duas correlações são recalculadas em cada replicação (Tabela 9). A diferença observada é Δ = 0,604 (0,751 − 0,146), com intervalo de confiança de 95% entre 0,547 e 0,665; nenhuma das 500 replicações apresentou diferença não positiva (p &lt; 0,001). O teste rejeita a igualdade entre as correlações: a queda de 0,751 para 0,146 não é ruído amostral, mas um padrão sistemático do painel — a covariância de níveis é dominada pela heterogeneidade persistente entre economias, não por uma associação contemporânea dentro do país.</w:t>
+        <w:t xml:space="preserve">A hipótese central deste estudo — a associação matrícula terciária × renda é forte entre países (níveis) e fraca dentro do país (primeiras diferenças) — é avaliada formalmente. Formulada como H0: ρ_níveis − ρ_primeiras diferenças ≤ 0 contra H1: ρ_níveis − ρ_primeiras diferenças &gt; 0, a hipótese é testada por bootstrap por país: os 135 países são re-amostrados com reposição (500 replicações, semente fixa) e as duas correlações são recalculadas em cada replicação (Tabela 9). A diferença observada é Δ = 0,604 (0,751 − 0,146, com valores arredondados; o cálculo exato é 0,7508 − 0,1465 = 0,6043), com intervalo de confiança de 95% entre 0,547 e 0,665; nenhuma das 500 replicações apresentou diferença não positiva (p &lt; 0,001). O teste rejeita a igualdade entre as correlações: a queda de 0,751 para 0,146 não é ruído amostral, mas um padrão sistemático do painel — a covariância de níveis é dominada pela heterogeneidade persistente entre economias, não por uma associação contemporânea dentro do país.</w:t>
       </w:r>
     </w:p>
     <w:tbl>
@@ -3572,7 +3584,7 @@
               <w:pStyle w:val="Compact"/>
             </w:pPr>
             <w:r>
-              <w:t xml:space="preserve">Oriente Médio e Norte da África</w:t>
+              <w:t xml:space="preserve">Oriente Médio, Norte da África, Afeganistão e Paquistão</w:t>
             </w:r>
           </w:p>
         </w:tc>
@@ -4237,84 +4249,76 @@
       </w:r>
     </w:p>
     <w:bookmarkEnd w:id="29"/>
-    <w:bookmarkStart w:id="32" w:name="referências"/>
+    <w:bookmarkStart w:id="30" w:name="declarações"/>
     <w:p>
       <w:pPr>
         <w:pStyle w:val="Heading2"/>
       </w:pPr>
       <w:r>
-        <w:t xml:space="preserve">Referências</w:t>
+        <w:t xml:space="preserve">Declarações</w:t>
       </w:r>
     </w:p>
     <w:p>
       <w:pPr>
         <w:pStyle w:val="FirstParagraph"/>
       </w:pPr>
-      <w:r>
-        <w:t xml:space="preserve">ACEMOGLU, D.; GALLEGO, F. A.; ROBINSON, J. A. Institutions, human capital, and development.</w:t>
-      </w:r>
-      <w:r>
-        <w:t xml:space="preserve"> </w:t>
-      </w:r>
       <w:r>
         <w:rPr>
           <w:b/>
           <w:bCs/>
         </w:rPr>
-        <w:t xml:space="preserve">Annual Review of Economics</w:t>
-      </w:r>
-      <w:r>
-        <w:t xml:space="preserve">, v. 6, p. 875-912, 2014. DOI: 10.1146/annurev-economics-080213-041119.</w:t>
+        <w:t xml:space="preserve">Conflito de interesses</w:t>
+      </w:r>
+      <w:r>
+        <w:t xml:space="preserve">: os autores declaram não haver conflito de interesses.</w:t>
       </w:r>
     </w:p>
     <w:p>
       <w:pPr>
         <w:pStyle w:val="BodyText"/>
       </w:pPr>
-      <w:r>
-        <w:t xml:space="preserve">AIYAR, S. et al. Growth slowdowns and the middle-income trap.</w:t>
-      </w:r>
-      <w:r>
-        <w:t xml:space="preserve"> </w:t>
-      </w:r>
       <w:r>
         <w:rPr>
           <w:b/>
           <w:bCs/>
         </w:rPr>
-        <w:t xml:space="preserve">Japan and the World Economy</w:t>
-      </w:r>
-      <w:r>
-        <w:t xml:space="preserve">, v. 48, p. 22-37, 2018. DOI: 10.1016/j.japwor.2018.07.001.</w:t>
+        <w:t xml:space="preserve">Financiamento</w:t>
+      </w:r>
+      <w:r>
+        <w:t xml:space="preserve">: o estudo não recebeu financiamento específico de agências dos setores público, privado ou sem fins lucrativos.</w:t>
       </w:r>
     </w:p>
     <w:p>
       <w:pPr>
         <w:pStyle w:val="BodyText"/>
       </w:pPr>
-      <w:r>
-        <w:t xml:space="preserve">BARRO, R. J.; LEE, J. W. A new data set of educational attainment in the world, 1950–2010.</w:t>
-      </w:r>
-      <w:r>
-        <w:t xml:space="preserve"> </w:t>
-      </w:r>
       <w:r>
         <w:rPr>
           <w:b/>
           <w:bCs/>
         </w:rPr>
-        <w:t xml:space="preserve">Journal of Development Economics</w:t>
-      </w:r>
-      <w:r>
-        <w:t xml:space="preserve">, v. 104, p. 184-198, 2013. DOI: 10.1016/j.jdeveco.2012.10.001.</w:t>
-      </w:r>
-    </w:p>
-    <w:p>
-      <w:pPr>
-        <w:pStyle w:val="BodyText"/>
-      </w:pPr>
-      <w:r>
-        <w:t xml:space="preserve">BREIMAN, L. Random forests.</w:t>
+        <w:t xml:space="preserve">Disponibilidade de dados e código</w:t>
+      </w:r>
+      <w:r>
+        <w:t xml:space="preserve">: todos os dados provêm de fontes oficiais públicas do Banco Mundial (World Development Indicators e Worldwide Governance Indicators), coletados com cache imutável e manifesto de integridade (SHA-256). O código, os scripts de análise e os artefatos de proveniência que sustentam cada número citado estão disponíveis em repositório público, permitindo a reprodução integral dos resultados.</w:t>
+      </w:r>
+    </w:p>
+    <w:bookmarkEnd w:id="30"/>
+    <w:bookmarkStart w:id="33" w:name="referências"/>
+    <w:p>
+      <w:pPr>
+        <w:pStyle w:val="Heading2"/>
+      </w:pPr>
+      <w:r>
+        <w:t xml:space="preserve">Referências</w:t>
+      </w:r>
+    </w:p>
+    <w:p>
+      <w:pPr>
+        <w:pStyle w:val="FirstParagraph"/>
+      </w:pPr>
+      <w:r>
+        <w:t xml:space="preserve">ACEMOGLU, D.; GALLEGO, F. A.; ROBINSON, J. A. Institutions, human capital, and development.</w:t>
       </w:r>
       <w:r>
         <w:t xml:space="preserve"> </w:t>
@@ -4324,10 +4328,10 @@
           <w:b/>
           <w:bCs/>
         </w:rPr>
-        <w:t xml:space="preserve">Machine Learning</w:t>
-      </w:r>
-      <w:r>
-        <w:t xml:space="preserve">, v. 45, n. 1, p. 5-32, 2001. DOI: 10.1023/A:1010933404324.</w:t>
+        <w:t xml:space="preserve">Annual Review of Economics</w:t>
+      </w:r>
+      <w:r>
+        <w:t xml:space="preserve">, v. 6, p. 875-912, 2014. DOI: 10.1146/annurev-economics-080213-041119.</w:t>
       </w:r>
     </w:p>
     <w:p>
@@ -4335,7 +4339,7 @@
         <w:pStyle w:val="BodyText"/>
       </w:pPr>
       <w:r>
-        <w:t xml:space="preserve">CAMERON, A. C.; MILLER, D. L. A practitioner’s guide to cluster-robust inference.</w:t>
+        <w:t xml:space="preserve">AIYAR, S. et al. Growth slowdowns and the middle-income trap.</w:t>
       </w:r>
       <w:r>
         <w:t xml:space="preserve"> </w:t>
@@ -4345,10 +4349,10 @@
           <w:b/>
           <w:bCs/>
         </w:rPr>
-        <w:t xml:space="preserve">Journal of Human Resources</w:t>
-      </w:r>
-      <w:r>
-        <w:t xml:space="preserve">, v. 50, n. 2, p. 317-372, 2015. DOI: 10.3368/jhr.50.2.317.</w:t>
+        <w:t xml:space="preserve">Japan and the World Economy</w:t>
+      </w:r>
+      <w:r>
+        <w:t xml:space="preserve">, v. 48, p. 22-37, 2018. DOI: 10.1016/j.japwor.2018.07.001.</w:t>
       </w:r>
     </w:p>
     <w:p>
@@ -4356,7 +4360,7 @@
         <w:pStyle w:val="BodyText"/>
       </w:pPr>
       <w:r>
-        <w:t xml:space="preserve">EICHENGREEN, B.; PARK, D.; SHIN, K. When fast-growing economies slow down: international evidence and implications for China.</w:t>
+        <w:t xml:space="preserve">BARRO, R. J.; LEE, J. W. A new data set of educational attainment in the world, 1950–2010.</w:t>
       </w:r>
       <w:r>
         <w:t xml:space="preserve"> </w:t>
@@ -4366,10 +4370,10 @@
           <w:b/>
           <w:bCs/>
         </w:rPr>
-        <w:t xml:space="preserve">Asian Economic Papers</w:t>
-      </w:r>
-      <w:r>
-        <w:t xml:space="preserve">, v. 11, n. 1, p. 42-87, 2012. DOI: 10.1162/ASEP_a_00118.</w:t>
+        <w:t xml:space="preserve">Journal of Development Economics</w:t>
+      </w:r>
+      <w:r>
+        <w:t xml:space="preserve">, v. 104, p. 184-198, 2013. DOI: 10.1016/j.jdeveco.2012.10.001.</w:t>
       </w:r>
     </w:p>
     <w:p>
@@ -4377,7 +4381,7 @@
         <w:pStyle w:val="BodyText"/>
       </w:pPr>
       <w:r>
-        <w:t xml:space="preserve">FELIPE, J.; ABDON, A.; KUMAR, U. Tracking the middle-income trap: what is it, who is in it, and why?</w:t>
+        <w:t xml:space="preserve">BREIMAN, L. Random forests.</w:t>
       </w:r>
       <w:r>
         <w:t xml:space="preserve"> </w:t>
@@ -4387,10 +4391,10 @@
           <w:b/>
           <w:bCs/>
         </w:rPr>
-        <w:t xml:space="preserve">Asian Development Review</w:t>
-      </w:r>
-      <w:r>
-        <w:t xml:space="preserve">, v. 29, n. 1, 2012. DOI: 10.2139/ssrn.2049330.</w:t>
+        <w:t xml:space="preserve">Machine Learning</w:t>
+      </w:r>
+      <w:r>
+        <w:t xml:space="preserve">, v. 45, n. 1, p. 5-32, 2001. DOI: 10.1023/A:1010933404324.</w:t>
       </w:r>
     </w:p>
     <w:p>
@@ -4398,7 +4402,7 @@
         <w:pStyle w:val="BodyText"/>
       </w:pPr>
       <w:r>
-        <w:t xml:space="preserve">HANUSHEK, E. A.; WOESSMANN, L. Education and economic growth. In: PETERSON, P.; BAKER, E.; McGAW, B. (Ed.).</w:t>
+        <w:t xml:space="preserve">CAMERON, A. C.; MILLER, D. L. A practitioner’s guide to cluster-robust inference.</w:t>
       </w:r>
       <w:r>
         <w:t xml:space="preserve"> </w:t>
@@ -4408,6 +4412,69 @@
           <w:b/>
           <w:bCs/>
         </w:rPr>
+        <w:t xml:space="preserve">Journal of Human Resources</w:t>
+      </w:r>
+      <w:r>
+        <w:t xml:space="preserve">, v. 50, n. 2, p. 317-372, 2015. DOI: 10.3368/jhr.50.2.317.</w:t>
+      </w:r>
+    </w:p>
+    <w:p>
+      <w:pPr>
+        <w:pStyle w:val="BodyText"/>
+      </w:pPr>
+      <w:r>
+        <w:t xml:space="preserve">EICHENGREEN, B.; PARK, D.; SHIN, K. When fast-growing economies slow down: international evidence and implications for China.</w:t>
+      </w:r>
+      <w:r>
+        <w:t xml:space="preserve"> </w:t>
+      </w:r>
+      <w:r>
+        <w:rPr>
+          <w:b/>
+          <w:bCs/>
+        </w:rPr>
+        <w:t xml:space="preserve">Asian Economic Papers</w:t>
+      </w:r>
+      <w:r>
+        <w:t xml:space="preserve">, v. 11, n. 1, p. 42-87, 2012. DOI: 10.1162/ASEP_a_00118.</w:t>
+      </w:r>
+    </w:p>
+    <w:p>
+      <w:pPr>
+        <w:pStyle w:val="BodyText"/>
+      </w:pPr>
+      <w:r>
+        <w:t xml:space="preserve">FELIPE, J.; ABDON, A.; KUMAR, U. Tracking the middle-income trap: what is it, who is in it, and why?</w:t>
+      </w:r>
+      <w:r>
+        <w:t xml:space="preserve"> </w:t>
+      </w:r>
+      <w:r>
+        <w:rPr>
+          <w:b/>
+          <w:bCs/>
+        </w:rPr>
+        <w:t xml:space="preserve">Asian Development Review</w:t>
+      </w:r>
+      <w:r>
+        <w:t xml:space="preserve">, v. 29, n. 1, 2012. DOI: 10.2139/ssrn.2049330.</w:t>
+      </w:r>
+    </w:p>
+    <w:p>
+      <w:pPr>
+        <w:pStyle w:val="BodyText"/>
+      </w:pPr>
+      <w:r>
+        <w:t xml:space="preserve">HANUSHEK, E. A.; WOESSMANN, L. Education and economic growth. In: PETERSON, P.; BAKER, E.; McGAW, B. (Ed.).</w:t>
+      </w:r>
+      <w:r>
+        <w:t xml:space="preserve"> </w:t>
+      </w:r>
+      <w:r>
+        <w:rPr>
+          <w:b/>
+          <w:bCs/>
+        </w:rPr>
         <w:t xml:space="preserve">International Encyclopedia of Education</w:t>
       </w:r>
       <w:r>
@@ -4416,7 +4483,7 @@
       <w:r>
         <w:t xml:space="preserve"> </w:t>
       </w:r>
-      <w:hyperlink r:id="rId30">
+      <w:hyperlink r:id="rId31">
         <w:r>
           <w:rPr>
             <w:rStyle w:val="Hyperlink"/>
@@ -4640,7 +4707,7 @@
       <w:r>
         <w:t xml:space="preserve"> </w:t>
       </w:r>
-      <w:hyperlink r:id="rId31">
+      <w:hyperlink r:id="rId32">
         <w:r>
           <w:rPr>
             <w:rStyle w:val="Hyperlink"/>
@@ -4652,8 +4719,8 @@
         <w:t xml:space="preserve">.</w:t>
       </w:r>
     </w:p>
-    <w:bookmarkEnd w:id="32"/>
-    <w:bookmarkStart w:id="36" w:name="X3274d0ba60d213e2c6009073b822d12d7337fba"/>
+    <w:bookmarkEnd w:id="33"/>
+    <w:bookmarkStart w:id="37" w:name="X3274d0ba60d213e2c6009073b822d12d7337fba"/>
     <w:p>
       <w:pPr>
         <w:pStyle w:val="Heading2"/>
@@ -4670,7 +4737,7 @@
         <w:t xml:space="preserve">Este apêndice consolida os símbolos estatísticos, os códigos oficiais dos indicadores e as siglas utilizadas no manuscrito, para facilitar a leitura. Todos os códigos referem-se ao World Development Indicators (WDI) e ao Worldwide Governance Indicators (WGI) do Banco Mundial.</w:t>
       </w:r>
     </w:p>
-    <w:bookmarkStart w:id="33" w:name="a.1-símbolos-estatísticos"/>
+    <w:bookmarkStart w:id="34" w:name="a.1-símbolos-estatísticos"/>
     <w:p>
       <w:pPr>
         <w:pStyle w:val="Heading3"/>
@@ -5054,8 +5121,8 @@
         </w:tc>
       </w:tr>
     </w:tbl>
-    <w:bookmarkEnd w:id="33"/>
-    <w:bookmarkStart w:id="34" w:name="a.2-códigos-de-indicadores-wdiwgi"/>
+    <w:bookmarkEnd w:id="34"/>
+    <w:bookmarkStart w:id="35" w:name="a.2-códigos-de-indicadores-wdiwgi"/>
     <w:p>
       <w:pPr>
         <w:pStyle w:val="Heading3"/>
@@ -5710,8 +5777,8 @@
         </w:tc>
       </w:tr>
     </w:tbl>
-    <w:bookmarkEnd w:id="34"/>
-    <w:bookmarkStart w:id="35" w:name="a.3-abreviaturas"/>
+    <w:bookmarkEnd w:id="35"/>
+    <w:bookmarkStart w:id="36" w:name="a.3-abreviaturas"/>
     <w:p>
       <w:pPr>
         <w:pStyle w:val="Heading3"/>
@@ -6041,7 +6108,7 @@
               <w:pStyle w:val="Compact"/>
             </w:pPr>
             <w:r>
-              <w:t xml:space="preserve">Revista Brasileira de Estudos de População (periódico-alvo)</w:t>
+              <w:t xml:space="preserve">Revista Brasileira de Estudos Pedagógicos (periódico-alvo)</w:t>
             </w:r>
           </w:p>
         </w:tc>
@@ -6119,9 +6186,9 @@
         </w:tc>
       </w:tr>
     </w:tbl>
-    <w:bookmarkEnd w:id="35"/>
     <w:bookmarkEnd w:id="36"/>
     <w:bookmarkEnd w:id="37"/>
+    <w:bookmarkEnd w:id="38"/>
     <w:sectPr>
       <w:footnotePr>
         <w:numRestart w:val="eachSect"/>

</xml_diff>

<commit_message>
feat(arm-education): melhorias metodológicas pós-peer-review (R423)
- LOOCV: distribuição dos folds de teste (mediana 0,778 vs média 0,542;
  DP 0,508; 83% positivos); instabilidade associada a n pequeno
  (corr n_obs × |ρ| = 0,248; p = 0,004) qualifica a queda 0,751→0,542
- FE comparativo sem cluster: 0,073 (SE 0,055; IC [−0,036; 0,182];
  p = 0,190) confirma estreitamento sem alterar a conclusão de não-detecção
- MDES = 0,173 (poder 80%, α 5%) e TOST ±0,10 (p = 0,329) e ±0,05
  (p = 0,644) — leitura honesta: não-detecção, não equivalência
- Script analyze_metodologia_suplementar.py + provenance_r423.json
  (números R412/R418/R419 inalterados; CSVs não versionados por política)
- MD/TeX: nota 4.3, Tabela 5b, nova subseção 4.10; PDF 20p 0 Overfull;
  DOCX 16 tabelas
- Testes R423 (15) + ajustes R419/R421; suíte R408-R423 com 366 passed
- EvolutionRegistry: R423 (241 ciclos); evo-54 documentado
</commit_message>
<xml_diff>
--- a/academic/papers/arm_education_audit/outputs/docx/ARTIGO_RBEP_SUBMISSAO.docx
+++ b/academic/papers/arm_education_audit/outputs/docx/ARTIGO_RBEP_SUBMISSAO.docx
@@ -28,7 +28,7 @@
         </w:p>
       </w:sdtContent>
     </w:sdt>
-    <w:bookmarkStart w:id="38" w:name="X7264fb5a8c1f10fb3110502e6c193bad8ce706a"/>
+    <w:bookmarkStart w:id="39" w:name="X7264fb5a8c1f10fb3110502e6c193bad8ce706a"/>
     <w:p>
       <w:pPr>
         <w:pStyle w:val="Heading1"/>
@@ -591,7 +591,7 @@
     </w:p>
     <w:bookmarkEnd w:id="16"/>
     <w:bookmarkEnd w:id="17"/>
-    <w:bookmarkStart w:id="27" w:name="resultados"/>
+    <w:bookmarkStart w:id="28" w:name="resultados"/>
     <w:p>
       <w:pPr>
         <w:pStyle w:val="Heading2"/>
@@ -1574,6 +1574,38 @@
         <w:t xml:space="preserve">.</w:t>
       </w:r>
     </w:p>
+    <w:p>
+      <w:pPr>
+        <w:pStyle w:val="BodyText"/>
+      </w:pPr>
+      <w:r>
+        <w:t xml:space="preserve">A distribuição dos ρ de teste merece qualificação (Tabela 3b, disponível em</w:t>
+      </w:r>
+      <w:r>
+        <w:t xml:space="preserve"> </w:t>
+      </w:r>
+      <w:r>
+        <w:rPr>
+          <w:rStyle w:val="VerbatimChar"/>
+        </w:rPr>
+        <w:t xml:space="preserve">outputs/expanded/tabela12_loocv_dispersao.csv</w:t>
+      </w:r>
+      <w:r>
+        <w:t xml:space="preserve">): a média de 0,542 esconde forte dispersão e assimetria — a mediana é 0,778, o desvio-padrão é 0,508 e 83% dos folds de teste apresentam correlação positiva. A média baixa é puxada por um conjunto pequeno de países com ρ fortemente negativo, e a instabilidade é maior em países com poucas observações: a correlação entre o número de observações do país e o valor absoluto do ρ de teste é positiva (0,248; p = 0,004; n = 20 a 54 por país). A leitura</w:t>
+      </w:r>
+      <w:r>
+        <w:t xml:space="preserve"> </w:t>
+      </w:r>
+      <w:r>
+        <w:t xml:space="preserve">“a associação de níveis é dominada pela variação entre países no treino”</w:t>
+      </w:r>
+      <w:r>
+        <w:t xml:space="preserve"> </w:t>
+      </w:r>
+      <w:r>
+        <w:t xml:space="preserve">permanece, mas com a ressalva de que parte da queda de 0,751 para 0,542 reflete imprecisão amostral em amostras pequenas, e não apenas ausência de transferibilidade.</w:t>
+      </w:r>
+    </w:p>
     <w:bookmarkEnd w:id="20"/>
     <w:bookmarkStart w:id="21" w:name="subperíodos"/>
     <w:p>
@@ -1761,7 +1793,7 @@
         <w:pStyle w:val="FirstParagraph"/>
       </w:pPr>
       <w:r>
-        <w:t xml:space="preserve">O painel com efeitos fixos de país e de ano, log do PIB per capita defasado em cinco anos e controles de gasto educacional, pesquisa e desenvolvimento, urbanização, manufatura e governança (WGI) produz o coeficiente reportado na Tabela 5. O coeficiente do log-PIB per capita defasado é 0,073 (IC95% −0,169 a 0,314; p = 0,555), com 106 clusters de país e 1.146 observações. O intervalo de confiança contém zero: uma vez introduzidos os controles institucionais e estruturais, nenhuma associação sistemática intra-país é identificável. A especificação com cluster por país é a principal; ignorar a correlação serial tenderia a estreitar artificialmente os intervalos (CAMERON; MILLER, 2015).</w:t>
+        <w:t xml:space="preserve">O painel com efeitos fixos de país e de ano, log do PIB per capita defasado em cinco anos e controles de gasto educacional, pesquisa e desenvolvimento, urbanização, manufatura e governança (WGI) produz o coeficiente reportado na Tabela 5. O coeficiente do log-PIB per capita defasado é 0,073 (IC95% −0,169 a 0,314; p = 0,555), com 106 clusters de país e 1.146 observações. O intervalo de confiança contém zero: uma vez introduzidos os controles institucionais e estruturais, nenhuma associação sistemática intra-país é identificável. A especificação com cluster por país é a principal; a comparação com erros padrão homocedásticos (Tabela 5b) confirma o diagnóstico: sem cluster o intervalo estreita-se (0,073; IC95% −0,036 a 0,182; p = 0,190), mas permanece contendo o zero e a conclusão de não-detecção se mantém — o ajuste à correlação serial por país amplia a incerteza, sem alterar a leitura substantiva (CAMERON; MILLER, 2015).</w:t>
       </w:r>
     </w:p>
     <w:tbl>
@@ -1953,182 +1985,6 @@
         <w:t xml:space="preserve">; erros padrão clusterizados por país.</w:t>
       </w:r>
     </w:p>
-    <w:bookmarkEnd w:id="22"/>
-    <w:bookmarkStart w:id="23" w:name="Xff78ab7c5d285ed443f9ac286dd18b2af18ce4c"/>
-    <w:p>
-      <w:pPr>
-        <w:pStyle w:val="Heading3"/>
-      </w:pPr>
-      <w:r>
-        <w:t xml:space="preserve">4.6 Exercício preditivo com validação agrupada</w:t>
-      </w:r>
-    </w:p>
-    <w:p>
-      <w:pPr>
-        <w:pStyle w:val="FirstParagraph"/>
-      </w:pPr>
-      <w:r>
-        <w:t xml:space="preserve">Com partição aleatória por linha — que permite ao modelo</w:t>
-      </w:r>
-      <w:r>
-        <w:t xml:space="preserve"> </w:t>
-      </w:r>
-      <w:r>
-        <w:t xml:space="preserve">“memorizar”</w:t>
-      </w:r>
-      <w:r>
-        <w:t xml:space="preserve"> </w:t>
-      </w:r>
-      <w:r>
-        <w:t xml:space="preserve">países — a área sob a curva ROC é 0,694 (Tabela 6). Com validação cruzada agrupada por país (GroupKFold), em que cada país de teste esteve totalmente ausente do treino, a área cai para 0,609, próxima do acaso (0,500). A diferença indica que a capacidade preditiva aparente depende parcialmente de características específicas dos países do treino: mesmo com 135 economias, o modelo não identifica um padrão transferível entre países não vistos.</w:t>
-      </w:r>
-    </w:p>
-    <w:tbl>
-      <w:tblPr>
-        <w:tblStyle w:val="Table"/>
-        <w:tblW w:type="auto" w:w="0"/>
-        <w:tblLook w:firstRow="1" w:lastRow="0" w:firstColumn="0" w:lastColumn="0" w:noHBand="0" w:noVBand="0" w:val="0020"/>
-      </w:tblPr>
-      <w:tblGrid>
-        <w:gridCol w:w="3960"/>
-        <w:gridCol w:w="3960"/>
-      </w:tblGrid>
-      <w:tr>
-        <w:trPr>
-          <w:tblHeader w:val="on"/>
-        </w:trPr>
-        <w:tc>
-          <w:tcPr/>
-          <w:p>
-            <w:pPr>
-              <w:pStyle w:val="Compact"/>
-            </w:pPr>
-            <w:r>
-              <w:t xml:space="preserve">Partição</w:t>
-            </w:r>
-          </w:p>
-        </w:tc>
-        <w:tc>
-          <w:tcPr/>
-          <w:p>
-            <w:pPr>
-              <w:pStyle w:val="Compact"/>
-            </w:pPr>
-            <w:r>
-              <w:t xml:space="preserve">Área sob a curva ROC</w:t>
-            </w:r>
-          </w:p>
-        </w:tc>
-      </w:tr>
-      <w:tr>
-        <w:tc>
-          <w:tcPr/>
-          <w:p>
-            <w:pPr>
-              <w:pStyle w:val="Compact"/>
-            </w:pPr>
-            <w:r>
-              <w:t xml:space="preserve">Aleatória por linha (mesmo país no treino e no teste)</w:t>
-            </w:r>
-          </w:p>
-        </w:tc>
-        <w:tc>
-          <w:tcPr/>
-          <w:p>
-            <w:pPr>
-              <w:pStyle w:val="Compact"/>
-            </w:pPr>
-            <w:r>
-              <w:t xml:space="preserve">0,694</w:t>
-            </w:r>
-          </w:p>
-        </w:tc>
-      </w:tr>
-      <w:tr>
-        <w:tc>
-          <w:tcPr/>
-          <w:p>
-            <w:pPr>
-              <w:pStyle w:val="Compact"/>
-            </w:pPr>
-            <w:r>
-              <w:t xml:space="preserve">Agrupada por país (país de teste ausente do treino)</w:t>
-            </w:r>
-          </w:p>
-        </w:tc>
-        <w:tc>
-          <w:tcPr/>
-          <w:p>
-            <w:pPr>
-              <w:pStyle w:val="Compact"/>
-            </w:pPr>
-            <w:r>
-              <w:t xml:space="preserve">0,609</w:t>
-            </w:r>
-          </w:p>
-        </w:tc>
-      </w:tr>
-    </w:tbl>
-    <w:p>
-      <w:pPr>
-        <w:pStyle w:val="BodyText"/>
-      </w:pPr>
-      <w:r>
-        <w:rPr>
-          <w:i/>
-          <w:iCs/>
-        </w:rPr>
-        <w:t xml:space="preserve">Fonte: elaboração própria.</w:t>
-      </w:r>
-      <w:r>
-        <w:rPr>
-          <w:i/>
-          <w:iCs/>
-        </w:rPr>
-        <w:t xml:space="preserve"> </w:t>
-      </w:r>
-      <w:r>
-        <w:rPr>
-          <w:rStyle w:val="VerbatimChar"/>
-          <w:i/>
-          <w:iCs/>
-        </w:rPr>
-        <w:t xml:space="preserve">outputs/expanded/tabela6_ml_expandido.csv</w:t>
-      </w:r>
-      <w:r>
-        <w:rPr>
-          <w:i/>
-          <w:iCs/>
-        </w:rPr>
-        <w:t xml:space="preserve">. Alvo: crescimento do PIB per capita acima da mediana do período.</w:t>
-      </w:r>
-    </w:p>
-    <w:bookmarkEnd w:id="23"/>
-    <w:bookmarkStart w:id="24" w:name="X998c3adc3d64689d4aede3a94a35903a5c85e65"/>
-    <w:p>
-      <w:pPr>
-        <w:pStyle w:val="Heading3"/>
-      </w:pPr>
-      <w:r>
-        <w:t xml:space="preserve">4.7 Canais associativos da educação terciária</w:t>
-      </w:r>
-    </w:p>
-    <w:p>
-      <w:pPr>
-        <w:pStyle w:val="FirstParagraph"/>
-      </w:pPr>
-      <w:r>
-        <w:t xml:space="preserve">Para situar o que a associação matrícula terciária × renda capta, a Tabela 7 reporta correlações parciais de Pearson sobre resíduos, com intervalos de confiança por cluster bootstrap por país (500 replicações, semente fixa), e regressões com efeitos fixos de país e de ano. Controlar progressivamente por governança e estrutura econômica reduz a associação matrícula × log-PIB de 0,701 para 0,358; o controle adicional de saúde (expectativa de vida) a reduz a 0,105, com intervalo de confiança contendo zero (−0,090 a 0,288; n = 1146). A associação parcial de matrícula com saúde é alta (0,684; IC 0,639 a 0,728; n = 4374): parte da associação com a renda é indissociável de variações conjuntas com a saúde. A associação parcial com desigualdade é negativa (−0,184; IC −0,302 a −0,042; n = 1475), a de P&amp;D com exportação de alta tecnologia é positiva (0,250; IC 0,103 a 0,429; n = 1148) e a de gasto educacional com controle da corrupção é positiva (0,341; IC 0,247 a 0,423; n = 2441) — padrões associativos, não evidência de mecanismos causais.</w:t>
-      </w:r>
-    </w:p>
-    <w:p>
-      <w:pPr>
-        <w:pStyle w:val="BodyText"/>
-      </w:pPr>
-      <w:r>
-        <w:t xml:space="preserve">No painel com efeitos fixos, nenhum canal permanece detectável: saúde 0,535 (IC −0,257 a 1,327; p = 0,186; 106 clusters), desigualdade −0,104 (IC −2,802 a 2,594; p = 0,940; 77 clusters) e inovação 0,836 (IC −1,768 a 3,440; p = 0,529; 77 clusters). Uma interação exploratória entre matrícula defasada e governança (WGI) é positiva e estatisticamente distinta de zero (0,054; IC 0,017 a 0,092; p = 0,005), sugestiva de que a associação dentro do país é maior em economias com melhor governança; a interação com P&amp;D é indistinguível de zero (−0,003; IC −0,017 a 0,011; p = 0,668). Essas estimativas são exploratórias, não corrigidas para múltiplas comparações, e devem ser lidas com cautela.</w:t>
-      </w:r>
-    </w:p>
     <w:tbl>
       <w:tblPr>
         <w:tblStyle w:val="Table"/>
@@ -2154,336 +2010,165 @@
               <w:pStyle w:val="Compact"/>
             </w:pPr>
             <w:r>
-              <w:t xml:space="preserve">Associação</w:t>
-            </w:r>
-          </w:p>
-        </w:tc>
-        <w:tc>
-          <w:tcPr/>
-          <w:p>
-            <w:pPr>
-              <w:pStyle w:val="Compact"/>
-            </w:pPr>
-            <w:r>
-              <w:t xml:space="preserve">ρ parcial</w:t>
-            </w:r>
-          </w:p>
-        </w:tc>
-        <w:tc>
-          <w:tcPr/>
-          <w:p>
-            <w:pPr>
-              <w:pStyle w:val="Compact"/>
-            </w:pPr>
-            <w:r>
-              <w:t xml:space="preserve">IC95% (bootstrap)</w:t>
-            </w:r>
-          </w:p>
-        </w:tc>
-        <w:tc>
-          <w:tcPr/>
-          <w:p>
-            <w:pPr>
-              <w:pStyle w:val="Compact"/>
-            </w:pPr>
-            <w:r>
-              <w:t xml:space="preserve">n</w:t>
-            </w:r>
-          </w:p>
-        </w:tc>
-        <w:tc>
-          <w:tcPr/>
-          <w:p>
-            <w:pPr>
-              <w:pStyle w:val="Compact"/>
-            </w:pPr>
-            <w:r>
-              <w:t xml:space="preserve">Controle</w:t>
-            </w:r>
-          </w:p>
-        </w:tc>
-      </w:tr>
-      <w:tr>
-        <w:tc>
-          <w:tcPr/>
-          <w:p>
-            <w:pPr>
-              <w:pStyle w:val="Compact"/>
-            </w:pPr>
-            <w:r>
-              <w:t xml:space="preserve">Matrícula × saúde (expectativa de vida)</w:t>
-            </w:r>
-          </w:p>
-        </w:tc>
-        <w:tc>
-          <w:tcPr/>
-          <w:p>
-            <w:pPr>
-              <w:pStyle w:val="Compact"/>
-            </w:pPr>
-            <w:r>
-              <w:t xml:space="preserve">0,684</w:t>
-            </w:r>
-          </w:p>
-        </w:tc>
-        <w:tc>
-          <w:tcPr/>
-          <w:p>
-            <w:pPr>
-              <w:pStyle w:val="Compact"/>
-            </w:pPr>
-            <w:r>
-              <w:t xml:space="preserve">[0,639; 0,728]</w:t>
-            </w:r>
-          </w:p>
-        </w:tc>
-        <w:tc>
-          <w:tcPr/>
-          <w:p>
-            <w:pPr>
-              <w:pStyle w:val="Compact"/>
-            </w:pPr>
-            <w:r>
-              <w:t xml:space="preserve">4374</w:t>
-            </w:r>
-          </w:p>
-        </w:tc>
-        <w:tc>
-          <w:tcPr/>
-          <w:p>
-            <w:pPr>
-              <w:pStyle w:val="Compact"/>
-            </w:pPr>
-            <w:r>
-              <w:t xml:space="preserve">log-PIB</w:t>
-            </w:r>
-          </w:p>
-        </w:tc>
-      </w:tr>
-      <w:tr>
-        <w:tc>
-          <w:tcPr/>
-          <w:p>
-            <w:pPr>
-              <w:pStyle w:val="Compact"/>
-            </w:pPr>
-            <w:r>
-              <w:t xml:space="preserve">Matrícula × desigualdade (Gini)</w:t>
-            </w:r>
-          </w:p>
-        </w:tc>
-        <w:tc>
-          <w:tcPr/>
-          <w:p>
-            <w:pPr>
-              <w:pStyle w:val="Compact"/>
-            </w:pPr>
-            <w:r>
-              <w:t xml:space="preserve">−0,184</w:t>
-            </w:r>
-          </w:p>
-        </w:tc>
-        <w:tc>
-          <w:tcPr/>
-          <w:p>
-            <w:pPr>
-              <w:pStyle w:val="Compact"/>
-            </w:pPr>
-            <w:r>
-              <w:t xml:space="preserve">[−0,302; −0,042]</w:t>
-            </w:r>
-          </w:p>
-        </w:tc>
-        <w:tc>
-          <w:tcPr/>
-          <w:p>
-            <w:pPr>
-              <w:pStyle w:val="Compact"/>
-            </w:pPr>
-            <w:r>
-              <w:t xml:space="preserve">1475</w:t>
-            </w:r>
-          </w:p>
-        </w:tc>
-        <w:tc>
-          <w:tcPr/>
-          <w:p>
-            <w:pPr>
-              <w:pStyle w:val="Compact"/>
-            </w:pPr>
-            <w:r>
-              <w:t xml:space="preserve">log-PIB</w:t>
-            </w:r>
-          </w:p>
-        </w:tc>
-      </w:tr>
-      <w:tr>
-        <w:tc>
-          <w:tcPr/>
-          <w:p>
-            <w:pPr>
-              <w:pStyle w:val="Compact"/>
-            </w:pPr>
-            <w:r>
-              <w:t xml:space="preserve">Matrícula × inovação (export. alta tecnologia)</w:t>
-            </w:r>
-          </w:p>
-        </w:tc>
-        <w:tc>
-          <w:tcPr/>
-          <w:p>
-            <w:pPr>
-              <w:pStyle w:val="Compact"/>
-            </w:pPr>
-            <w:r>
-              <w:t xml:space="preserve">−0,002</w:t>
-            </w:r>
-          </w:p>
-        </w:tc>
-        <w:tc>
-          <w:tcPr/>
-          <w:p>
-            <w:pPr>
-              <w:pStyle w:val="Compact"/>
-            </w:pPr>
-            <w:r>
-              <w:t xml:space="preserve">[−0,120; 0,087]</w:t>
-            </w:r>
-          </w:p>
-        </w:tc>
-        <w:tc>
-          <w:tcPr/>
-          <w:p>
-            <w:pPr>
-              <w:pStyle w:val="Compact"/>
-            </w:pPr>
-            <w:r>
-              <w:t xml:space="preserve">1566</w:t>
-            </w:r>
-          </w:p>
-        </w:tc>
-        <w:tc>
-          <w:tcPr/>
-          <w:p>
-            <w:pPr>
-              <w:pStyle w:val="Compact"/>
-            </w:pPr>
-            <w:r>
-              <w:t xml:space="preserve">log-PIB</w:t>
-            </w:r>
-          </w:p>
-        </w:tc>
-      </w:tr>
-      <w:tr>
-        <w:tc>
-          <w:tcPr/>
-          <w:p>
-            <w:pPr>
-              <w:pStyle w:val="Compact"/>
-            </w:pPr>
-            <w:r>
-              <w:t xml:space="preserve">P&amp;D × inovação (export. alta tecnologia)</w:t>
-            </w:r>
-          </w:p>
-        </w:tc>
-        <w:tc>
-          <w:tcPr/>
-          <w:p>
-            <w:pPr>
-              <w:pStyle w:val="Compact"/>
-            </w:pPr>
-            <w:r>
-              <w:t xml:space="preserve">0,250</w:t>
-            </w:r>
-          </w:p>
-        </w:tc>
-        <w:tc>
-          <w:tcPr/>
-          <w:p>
-            <w:pPr>
-              <w:pStyle w:val="Compact"/>
-            </w:pPr>
-            <w:r>
-              <w:t xml:space="preserve">[0,103; 0,429]</w:t>
-            </w:r>
-          </w:p>
-        </w:tc>
-        <w:tc>
-          <w:tcPr/>
-          <w:p>
-            <w:pPr>
-              <w:pStyle w:val="Compact"/>
-            </w:pPr>
-            <w:r>
-              <w:t xml:space="preserve">1148</w:t>
-            </w:r>
-          </w:p>
-        </w:tc>
-        <w:tc>
-          <w:tcPr/>
-          <w:p>
-            <w:pPr>
-              <w:pStyle w:val="Compact"/>
-            </w:pPr>
-            <w:r>
-              <w:t xml:space="preserve">log-PIB</w:t>
-            </w:r>
-          </w:p>
-        </w:tc>
-      </w:tr>
-      <w:tr>
-        <w:tc>
-          <w:tcPr/>
-          <w:p>
-            <w:pPr>
-              <w:pStyle w:val="Compact"/>
-            </w:pPr>
-            <w:r>
-              <w:t xml:space="preserve">Gasto educacional × WGI controle da corrupção</w:t>
-            </w:r>
-          </w:p>
-        </w:tc>
-        <w:tc>
-          <w:tcPr/>
-          <w:p>
-            <w:pPr>
-              <w:pStyle w:val="Compact"/>
-            </w:pPr>
-            <w:r>
-              <w:t xml:space="preserve">0,341</w:t>
-            </w:r>
-          </w:p>
-        </w:tc>
-        <w:tc>
-          <w:tcPr/>
-          <w:p>
-            <w:pPr>
-              <w:pStyle w:val="Compact"/>
-            </w:pPr>
-            <w:r>
-              <w:t xml:space="preserve">[0,247; 0,423]</w:t>
-            </w:r>
-          </w:p>
-        </w:tc>
-        <w:tc>
-          <w:tcPr/>
-          <w:p>
-            <w:pPr>
-              <w:pStyle w:val="Compact"/>
-            </w:pPr>
-            <w:r>
-              <w:t xml:space="preserve">2441</w:t>
-            </w:r>
-          </w:p>
-        </w:tc>
-        <w:tc>
-          <w:tcPr/>
-          <w:p>
-            <w:pPr>
-              <w:pStyle w:val="Compact"/>
-            </w:pPr>
-            <w:r>
-              <w:t xml:space="preserve">log-PIB</w:t>
+              <w:t xml:space="preserve">Erros padrão</w:t>
+            </w:r>
+          </w:p>
+        </w:tc>
+        <w:tc>
+          <w:tcPr/>
+          <w:p>
+            <w:pPr>
+              <w:pStyle w:val="Compact"/>
+            </w:pPr>
+            <w:r>
+              <w:t xml:space="preserve">Coeficiente log-PIB pc (lag 5)</w:t>
+            </w:r>
+          </w:p>
+        </w:tc>
+        <w:tc>
+          <w:tcPr/>
+          <w:p>
+            <w:pPr>
+              <w:pStyle w:val="Compact"/>
+            </w:pPr>
+            <w:r>
+              <w:t xml:space="preserve">SE</w:t>
+            </w:r>
+          </w:p>
+        </w:tc>
+        <w:tc>
+          <w:tcPr/>
+          <w:p>
+            <w:pPr>
+              <w:pStyle w:val="Compact"/>
+            </w:pPr>
+            <w:r>
+              <w:t xml:space="preserve">IC95%</w:t>
+            </w:r>
+          </w:p>
+        </w:tc>
+        <w:tc>
+          <w:tcPr/>
+          <w:p>
+            <w:pPr>
+              <w:pStyle w:val="Compact"/>
+            </w:pPr>
+            <w:r>
+              <w:t xml:space="preserve">p</w:t>
+            </w:r>
+          </w:p>
+        </w:tc>
+      </w:tr>
+      <w:tr>
+        <w:tc>
+          <w:tcPr/>
+          <w:p>
+            <w:pPr>
+              <w:pStyle w:val="Compact"/>
+            </w:pPr>
+            <w:r>
+              <w:t xml:space="preserve">Clusterizados por país (principal)</w:t>
+            </w:r>
+          </w:p>
+        </w:tc>
+        <w:tc>
+          <w:tcPr/>
+          <w:p>
+            <w:pPr>
+              <w:pStyle w:val="Compact"/>
+            </w:pPr>
+            <w:r>
+              <w:t xml:space="preserve">0,073</w:t>
+            </w:r>
+          </w:p>
+        </w:tc>
+        <w:tc>
+          <w:tcPr/>
+          <w:p>
+            <w:pPr>
+              <w:pStyle w:val="Compact"/>
+            </w:pPr>
+            <w:r>
+              <w:t xml:space="preserve">0,062</w:t>
+            </w:r>
+          </w:p>
+        </w:tc>
+        <w:tc>
+          <w:tcPr/>
+          <w:p>
+            <w:pPr>
+              <w:pStyle w:val="Compact"/>
+            </w:pPr>
+            <w:r>
+              <w:t xml:space="preserve">[−0,169; 0,314]</w:t>
+            </w:r>
+          </w:p>
+        </w:tc>
+        <w:tc>
+          <w:tcPr/>
+          <w:p>
+            <w:pPr>
+              <w:pStyle w:val="Compact"/>
+            </w:pPr>
+            <w:r>
+              <w:t xml:space="preserve">0,555</w:t>
+            </w:r>
+          </w:p>
+        </w:tc>
+      </w:tr>
+      <w:tr>
+        <w:tc>
+          <w:tcPr/>
+          <w:p>
+            <w:pPr>
+              <w:pStyle w:val="Compact"/>
+            </w:pPr>
+            <w:r>
+              <w:t xml:space="preserve">Homocedásticos (comparação)</w:t>
+            </w:r>
+          </w:p>
+        </w:tc>
+        <w:tc>
+          <w:tcPr/>
+          <w:p>
+            <w:pPr>
+              <w:pStyle w:val="Compact"/>
+            </w:pPr>
+            <w:r>
+              <w:t xml:space="preserve">0,073</w:t>
+            </w:r>
+          </w:p>
+        </w:tc>
+        <w:tc>
+          <w:tcPr/>
+          <w:p>
+            <w:pPr>
+              <w:pStyle w:val="Compact"/>
+            </w:pPr>
+            <w:r>
+              <w:t xml:space="preserve">0,055</w:t>
+            </w:r>
+          </w:p>
+        </w:tc>
+        <w:tc>
+          <w:tcPr/>
+          <w:p>
+            <w:pPr>
+              <w:pStyle w:val="Compact"/>
+            </w:pPr>
+            <w:r>
+              <w:t xml:space="preserve">[−0,036; 0,182]</w:t>
+            </w:r>
+          </w:p>
+        </w:tc>
+        <w:tc>
+          <w:tcPr/>
+          <w:p>
+            <w:pPr>
+              <w:pStyle w:val="Compact"/>
+            </w:pPr>
+            <w:r>
+              <w:t xml:space="preserve">0,190</w:t>
             </w:r>
           </w:p>
         </w:tc>
@@ -2513,24 +2198,24 @@
           <w:i/>
           <w:iCs/>
         </w:rPr>
-        <w:t xml:space="preserve">outputs/channels/provenance_r413.json</w:t>
+        <w:t xml:space="preserve">outputs/expanded/tabela5b_cluster_comparativo.csv</w:t>
       </w:r>
       <w:r>
         <w:rPr>
           <w:i/>
           <w:iCs/>
         </w:rPr>
-        <w:t xml:space="preserve">; bootstrap por país (500 replicações, semente 42); painel FE com erros padrão clusterizados por país; sem inferência causal.</w:t>
-      </w:r>
-    </w:p>
-    <w:bookmarkEnd w:id="24"/>
-    <w:bookmarkStart w:id="25" w:name="Xddbeb14a89846d8ba3eb6c0bd0fd338014bee2b"/>
+        <w:t xml:space="preserve">; mesma especificação e mesma amostra (n = 1.146; 106 países), variando apenas o tratamento dos erros padrão.</w:t>
+      </w:r>
+    </w:p>
+    <w:bookmarkEnd w:id="22"/>
+    <w:bookmarkStart w:id="23" w:name="Xff78ab7c5d285ed443f9ac286dd18b2af18ce4c"/>
     <w:p>
       <w:pPr>
         <w:pStyle w:val="Heading3"/>
       </w:pPr>
       <w:r>
-        <w:t xml:space="preserve">4.8 O caso brasileiro em perspectiva comparada</w:t>
+        <w:t xml:space="preserve">4.6 Exercício preditivo com validação agrupada</w:t>
       </w:r>
     </w:p>
     <w:p>
@@ -2538,7 +2223,165 @@
         <w:pStyle w:val="FirstParagraph"/>
       </w:pPr>
       <w:r>
-        <w:t xml:space="preserve">O Brasil está ausente da amostra principal por uma limitação de cobertura, e não por decisão analítica: o WDI reporta matrícula terciária para o país apenas a partir de 2012 (11 observações não nulas até 2022, abaixo do limiar de 20 exigido para compor o painel de 135 economias). Para situar o caso brasileiro, a Tabela 8 compara o Brasil com a renda média asiática (China, Indonésia, Malásia, Tailândia e Vietnã), os Estados Unidos, a Europa Ocidental (Alemanha, França, Reino Unido, Itália, Espanha e Portugal), a China e dois vizinhos latino-americanos de renda média (México e Argentina), todos na janela comum 2012–2022, com a mesma fonte WDI. A cobertura é desbalanceada — os Estados Unidos e a Alemanha iniciam a série em 2013 e Portugal em 2015 —, e o crescimento médio anual do PIB per capita é calculado sobre o número real de anos disponíveis em cada unidade, sem imputação.</w:t>
+        <w:t xml:space="preserve">Com partição aleatória por linha — que permite ao modelo</w:t>
+      </w:r>
+      <w:r>
+        <w:t xml:space="preserve"> </w:t>
+      </w:r>
+      <w:r>
+        <w:t xml:space="preserve">“memorizar”</w:t>
+      </w:r>
+      <w:r>
+        <w:t xml:space="preserve"> </w:t>
+      </w:r>
+      <w:r>
+        <w:t xml:space="preserve">países — a área sob a curva ROC é 0,694 (Tabela 6). Com validação cruzada agrupada por país (GroupKFold), em que cada país de teste esteve totalmente ausente do treino, a área cai para 0,609, próxima do acaso (0,500). A diferença indica que a capacidade preditiva aparente depende parcialmente de características específicas dos países do treino: mesmo com 135 economias, o modelo não identifica um padrão transferível entre países não vistos.</w:t>
+      </w:r>
+    </w:p>
+    <w:tbl>
+      <w:tblPr>
+        <w:tblStyle w:val="Table"/>
+        <w:tblW w:type="auto" w:w="0"/>
+        <w:tblLook w:firstRow="1" w:lastRow="0" w:firstColumn="0" w:lastColumn="0" w:noHBand="0" w:noVBand="0" w:val="0020"/>
+      </w:tblPr>
+      <w:tblGrid>
+        <w:gridCol w:w="3960"/>
+        <w:gridCol w:w="3960"/>
+      </w:tblGrid>
+      <w:tr>
+        <w:trPr>
+          <w:tblHeader w:val="on"/>
+        </w:trPr>
+        <w:tc>
+          <w:tcPr/>
+          <w:p>
+            <w:pPr>
+              <w:pStyle w:val="Compact"/>
+            </w:pPr>
+            <w:r>
+              <w:t xml:space="preserve">Partição</w:t>
+            </w:r>
+          </w:p>
+        </w:tc>
+        <w:tc>
+          <w:tcPr/>
+          <w:p>
+            <w:pPr>
+              <w:pStyle w:val="Compact"/>
+            </w:pPr>
+            <w:r>
+              <w:t xml:space="preserve">Área sob a curva ROC</w:t>
+            </w:r>
+          </w:p>
+        </w:tc>
+      </w:tr>
+      <w:tr>
+        <w:tc>
+          <w:tcPr/>
+          <w:p>
+            <w:pPr>
+              <w:pStyle w:val="Compact"/>
+            </w:pPr>
+            <w:r>
+              <w:t xml:space="preserve">Aleatória por linha (mesmo país no treino e no teste)</w:t>
+            </w:r>
+          </w:p>
+        </w:tc>
+        <w:tc>
+          <w:tcPr/>
+          <w:p>
+            <w:pPr>
+              <w:pStyle w:val="Compact"/>
+            </w:pPr>
+            <w:r>
+              <w:t xml:space="preserve">0,694</w:t>
+            </w:r>
+          </w:p>
+        </w:tc>
+      </w:tr>
+      <w:tr>
+        <w:tc>
+          <w:tcPr/>
+          <w:p>
+            <w:pPr>
+              <w:pStyle w:val="Compact"/>
+            </w:pPr>
+            <w:r>
+              <w:t xml:space="preserve">Agrupada por país (país de teste ausente do treino)</w:t>
+            </w:r>
+          </w:p>
+        </w:tc>
+        <w:tc>
+          <w:tcPr/>
+          <w:p>
+            <w:pPr>
+              <w:pStyle w:val="Compact"/>
+            </w:pPr>
+            <w:r>
+              <w:t xml:space="preserve">0,609</w:t>
+            </w:r>
+          </w:p>
+        </w:tc>
+      </w:tr>
+    </w:tbl>
+    <w:p>
+      <w:pPr>
+        <w:pStyle w:val="BodyText"/>
+      </w:pPr>
+      <w:r>
+        <w:rPr>
+          <w:i/>
+          <w:iCs/>
+        </w:rPr>
+        <w:t xml:space="preserve">Fonte: elaboração própria.</w:t>
+      </w:r>
+      <w:r>
+        <w:rPr>
+          <w:i/>
+          <w:iCs/>
+        </w:rPr>
+        <w:t xml:space="preserve"> </w:t>
+      </w:r>
+      <w:r>
+        <w:rPr>
+          <w:rStyle w:val="VerbatimChar"/>
+          <w:i/>
+          <w:iCs/>
+        </w:rPr>
+        <w:t xml:space="preserve">outputs/expanded/tabela6_ml_expandido.csv</w:t>
+      </w:r>
+      <w:r>
+        <w:rPr>
+          <w:i/>
+          <w:iCs/>
+        </w:rPr>
+        <w:t xml:space="preserve">. Alvo: crescimento do PIB per capita acima da mediana do período.</w:t>
+      </w:r>
+    </w:p>
+    <w:bookmarkEnd w:id="23"/>
+    <w:bookmarkStart w:id="24" w:name="X998c3adc3d64689d4aede3a94a35903a5c85e65"/>
+    <w:p>
+      <w:pPr>
+        <w:pStyle w:val="Heading3"/>
+      </w:pPr>
+      <w:r>
+        <w:t xml:space="preserve">4.7 Canais associativos da educação terciária</w:t>
+      </w:r>
+    </w:p>
+    <w:p>
+      <w:pPr>
+        <w:pStyle w:val="FirstParagraph"/>
+      </w:pPr>
+      <w:r>
+        <w:t xml:space="preserve">Para situar o que a associação matrícula terciária × renda capta, a Tabela 7 reporta correlações parciais de Pearson sobre resíduos, com intervalos de confiança por cluster bootstrap por país (500 replicações, semente fixa), e regressões com efeitos fixos de país e de ano. Controlar progressivamente por governança e estrutura econômica reduz a associação matrícula × log-PIB de 0,701 para 0,358; o controle adicional de saúde (expectativa de vida) a reduz a 0,105, com intervalo de confiança contendo zero (−0,090 a 0,288; n = 1146). A associação parcial de matrícula com saúde é alta (0,684; IC 0,639 a 0,728; n = 4374): parte da associação com a renda é indissociável de variações conjuntas com a saúde. A associação parcial com desigualdade é negativa (−0,184; IC −0,302 a −0,042; n = 1475), a de P&amp;D com exportação de alta tecnologia é positiva (0,250; IC 0,103 a 0,429; n = 1148) e a de gasto educacional com controle da corrupção é positiva (0,341; IC 0,247 a 0,423; n = 2441) — padrões associativos, não evidência de mecanismos causais.</w:t>
+      </w:r>
+    </w:p>
+    <w:p>
+      <w:pPr>
+        <w:pStyle w:val="BodyText"/>
+      </w:pPr>
+      <w:r>
+        <w:t xml:space="preserve">No painel com efeitos fixos, nenhum canal permanece detectável: saúde 0,535 (IC −0,257 a 1,327; p = 0,186; 106 clusters), desigualdade −0,104 (IC −2,802 a 2,594; p = 0,940; 77 clusters) e inovação 0,836 (IC −1,768 a 3,440; p = 0,529; 77 clusters). Uma interação exploratória entre matrícula defasada e governança (WGI) é positiva e estatisticamente distinta de zero (0,054; IC 0,017 a 0,092; p = 0,005), sugestiva de que a associação dentro do país é maior em economias com melhor governança; a interação com P&amp;D é indistinguível de zero (−0,003; IC −0,017 a 0,011; p = 0,668). Essas estimativas são exploratórias, não corrigidas para múltiplas comparações, e devem ser lidas com cautela.</w:t>
       </w:r>
     </w:p>
     <w:tbl>
@@ -2566,6 +2409,418 @@
               <w:pStyle w:val="Compact"/>
             </w:pPr>
             <w:r>
+              <w:t xml:space="preserve">Associação</w:t>
+            </w:r>
+          </w:p>
+        </w:tc>
+        <w:tc>
+          <w:tcPr/>
+          <w:p>
+            <w:pPr>
+              <w:pStyle w:val="Compact"/>
+            </w:pPr>
+            <w:r>
+              <w:t xml:space="preserve">ρ parcial</w:t>
+            </w:r>
+          </w:p>
+        </w:tc>
+        <w:tc>
+          <w:tcPr/>
+          <w:p>
+            <w:pPr>
+              <w:pStyle w:val="Compact"/>
+            </w:pPr>
+            <w:r>
+              <w:t xml:space="preserve">IC95% (bootstrap)</w:t>
+            </w:r>
+          </w:p>
+        </w:tc>
+        <w:tc>
+          <w:tcPr/>
+          <w:p>
+            <w:pPr>
+              <w:pStyle w:val="Compact"/>
+            </w:pPr>
+            <w:r>
+              <w:t xml:space="preserve">n</w:t>
+            </w:r>
+          </w:p>
+        </w:tc>
+        <w:tc>
+          <w:tcPr/>
+          <w:p>
+            <w:pPr>
+              <w:pStyle w:val="Compact"/>
+            </w:pPr>
+            <w:r>
+              <w:t xml:space="preserve">Controle</w:t>
+            </w:r>
+          </w:p>
+        </w:tc>
+      </w:tr>
+      <w:tr>
+        <w:tc>
+          <w:tcPr/>
+          <w:p>
+            <w:pPr>
+              <w:pStyle w:val="Compact"/>
+            </w:pPr>
+            <w:r>
+              <w:t xml:space="preserve">Matrícula × saúde (expectativa de vida)</w:t>
+            </w:r>
+          </w:p>
+        </w:tc>
+        <w:tc>
+          <w:tcPr/>
+          <w:p>
+            <w:pPr>
+              <w:pStyle w:val="Compact"/>
+            </w:pPr>
+            <w:r>
+              <w:t xml:space="preserve">0,684</w:t>
+            </w:r>
+          </w:p>
+        </w:tc>
+        <w:tc>
+          <w:tcPr/>
+          <w:p>
+            <w:pPr>
+              <w:pStyle w:val="Compact"/>
+            </w:pPr>
+            <w:r>
+              <w:t xml:space="preserve">[0,639; 0,728]</w:t>
+            </w:r>
+          </w:p>
+        </w:tc>
+        <w:tc>
+          <w:tcPr/>
+          <w:p>
+            <w:pPr>
+              <w:pStyle w:val="Compact"/>
+            </w:pPr>
+            <w:r>
+              <w:t xml:space="preserve">4374</w:t>
+            </w:r>
+          </w:p>
+        </w:tc>
+        <w:tc>
+          <w:tcPr/>
+          <w:p>
+            <w:pPr>
+              <w:pStyle w:val="Compact"/>
+            </w:pPr>
+            <w:r>
+              <w:t xml:space="preserve">log-PIB</w:t>
+            </w:r>
+          </w:p>
+        </w:tc>
+      </w:tr>
+      <w:tr>
+        <w:tc>
+          <w:tcPr/>
+          <w:p>
+            <w:pPr>
+              <w:pStyle w:val="Compact"/>
+            </w:pPr>
+            <w:r>
+              <w:t xml:space="preserve">Matrícula × desigualdade (Gini)</w:t>
+            </w:r>
+          </w:p>
+        </w:tc>
+        <w:tc>
+          <w:tcPr/>
+          <w:p>
+            <w:pPr>
+              <w:pStyle w:val="Compact"/>
+            </w:pPr>
+            <w:r>
+              <w:t xml:space="preserve">−0,184</w:t>
+            </w:r>
+          </w:p>
+        </w:tc>
+        <w:tc>
+          <w:tcPr/>
+          <w:p>
+            <w:pPr>
+              <w:pStyle w:val="Compact"/>
+            </w:pPr>
+            <w:r>
+              <w:t xml:space="preserve">[−0,302; −0,042]</w:t>
+            </w:r>
+          </w:p>
+        </w:tc>
+        <w:tc>
+          <w:tcPr/>
+          <w:p>
+            <w:pPr>
+              <w:pStyle w:val="Compact"/>
+            </w:pPr>
+            <w:r>
+              <w:t xml:space="preserve">1475</w:t>
+            </w:r>
+          </w:p>
+        </w:tc>
+        <w:tc>
+          <w:tcPr/>
+          <w:p>
+            <w:pPr>
+              <w:pStyle w:val="Compact"/>
+            </w:pPr>
+            <w:r>
+              <w:t xml:space="preserve">log-PIB</w:t>
+            </w:r>
+          </w:p>
+        </w:tc>
+      </w:tr>
+      <w:tr>
+        <w:tc>
+          <w:tcPr/>
+          <w:p>
+            <w:pPr>
+              <w:pStyle w:val="Compact"/>
+            </w:pPr>
+            <w:r>
+              <w:t xml:space="preserve">Matrícula × inovação (export. alta tecnologia)</w:t>
+            </w:r>
+          </w:p>
+        </w:tc>
+        <w:tc>
+          <w:tcPr/>
+          <w:p>
+            <w:pPr>
+              <w:pStyle w:val="Compact"/>
+            </w:pPr>
+            <w:r>
+              <w:t xml:space="preserve">−0,002</w:t>
+            </w:r>
+          </w:p>
+        </w:tc>
+        <w:tc>
+          <w:tcPr/>
+          <w:p>
+            <w:pPr>
+              <w:pStyle w:val="Compact"/>
+            </w:pPr>
+            <w:r>
+              <w:t xml:space="preserve">[−0,120; 0,087]</w:t>
+            </w:r>
+          </w:p>
+        </w:tc>
+        <w:tc>
+          <w:tcPr/>
+          <w:p>
+            <w:pPr>
+              <w:pStyle w:val="Compact"/>
+            </w:pPr>
+            <w:r>
+              <w:t xml:space="preserve">1566</w:t>
+            </w:r>
+          </w:p>
+        </w:tc>
+        <w:tc>
+          <w:tcPr/>
+          <w:p>
+            <w:pPr>
+              <w:pStyle w:val="Compact"/>
+            </w:pPr>
+            <w:r>
+              <w:t xml:space="preserve">log-PIB</w:t>
+            </w:r>
+          </w:p>
+        </w:tc>
+      </w:tr>
+      <w:tr>
+        <w:tc>
+          <w:tcPr/>
+          <w:p>
+            <w:pPr>
+              <w:pStyle w:val="Compact"/>
+            </w:pPr>
+            <w:r>
+              <w:t xml:space="preserve">P&amp;D × inovação (export. alta tecnologia)</w:t>
+            </w:r>
+          </w:p>
+        </w:tc>
+        <w:tc>
+          <w:tcPr/>
+          <w:p>
+            <w:pPr>
+              <w:pStyle w:val="Compact"/>
+            </w:pPr>
+            <w:r>
+              <w:t xml:space="preserve">0,250</w:t>
+            </w:r>
+          </w:p>
+        </w:tc>
+        <w:tc>
+          <w:tcPr/>
+          <w:p>
+            <w:pPr>
+              <w:pStyle w:val="Compact"/>
+            </w:pPr>
+            <w:r>
+              <w:t xml:space="preserve">[0,103; 0,429]</w:t>
+            </w:r>
+          </w:p>
+        </w:tc>
+        <w:tc>
+          <w:tcPr/>
+          <w:p>
+            <w:pPr>
+              <w:pStyle w:val="Compact"/>
+            </w:pPr>
+            <w:r>
+              <w:t xml:space="preserve">1148</w:t>
+            </w:r>
+          </w:p>
+        </w:tc>
+        <w:tc>
+          <w:tcPr/>
+          <w:p>
+            <w:pPr>
+              <w:pStyle w:val="Compact"/>
+            </w:pPr>
+            <w:r>
+              <w:t xml:space="preserve">log-PIB</w:t>
+            </w:r>
+          </w:p>
+        </w:tc>
+      </w:tr>
+      <w:tr>
+        <w:tc>
+          <w:tcPr/>
+          <w:p>
+            <w:pPr>
+              <w:pStyle w:val="Compact"/>
+            </w:pPr>
+            <w:r>
+              <w:t xml:space="preserve">Gasto educacional × WGI controle da corrupção</w:t>
+            </w:r>
+          </w:p>
+        </w:tc>
+        <w:tc>
+          <w:tcPr/>
+          <w:p>
+            <w:pPr>
+              <w:pStyle w:val="Compact"/>
+            </w:pPr>
+            <w:r>
+              <w:t xml:space="preserve">0,341</w:t>
+            </w:r>
+          </w:p>
+        </w:tc>
+        <w:tc>
+          <w:tcPr/>
+          <w:p>
+            <w:pPr>
+              <w:pStyle w:val="Compact"/>
+            </w:pPr>
+            <w:r>
+              <w:t xml:space="preserve">[0,247; 0,423]</w:t>
+            </w:r>
+          </w:p>
+        </w:tc>
+        <w:tc>
+          <w:tcPr/>
+          <w:p>
+            <w:pPr>
+              <w:pStyle w:val="Compact"/>
+            </w:pPr>
+            <w:r>
+              <w:t xml:space="preserve">2441</w:t>
+            </w:r>
+          </w:p>
+        </w:tc>
+        <w:tc>
+          <w:tcPr/>
+          <w:p>
+            <w:pPr>
+              <w:pStyle w:val="Compact"/>
+            </w:pPr>
+            <w:r>
+              <w:t xml:space="preserve">log-PIB</w:t>
+            </w:r>
+          </w:p>
+        </w:tc>
+      </w:tr>
+    </w:tbl>
+    <w:p>
+      <w:pPr>
+        <w:pStyle w:val="BodyText"/>
+      </w:pPr>
+      <w:r>
+        <w:rPr>
+          <w:i/>
+          <w:iCs/>
+        </w:rPr>
+        <w:t xml:space="preserve">Fonte: elaboração própria.</w:t>
+      </w:r>
+      <w:r>
+        <w:rPr>
+          <w:i/>
+          <w:iCs/>
+        </w:rPr>
+        <w:t xml:space="preserve"> </w:t>
+      </w:r>
+      <w:r>
+        <w:rPr>
+          <w:rStyle w:val="VerbatimChar"/>
+          <w:i/>
+          <w:iCs/>
+        </w:rPr>
+        <w:t xml:space="preserve">outputs/channels/provenance_r413.json</w:t>
+      </w:r>
+      <w:r>
+        <w:rPr>
+          <w:i/>
+          <w:iCs/>
+        </w:rPr>
+        <w:t xml:space="preserve">; bootstrap por país (500 replicações, semente 42); painel FE com erros padrão clusterizados por país; sem inferência causal.</w:t>
+      </w:r>
+    </w:p>
+    <w:bookmarkEnd w:id="24"/>
+    <w:bookmarkStart w:id="25" w:name="Xddbeb14a89846d8ba3eb6c0bd0fd338014bee2b"/>
+    <w:p>
+      <w:pPr>
+        <w:pStyle w:val="Heading3"/>
+      </w:pPr>
+      <w:r>
+        <w:t xml:space="preserve">4.8 O caso brasileiro em perspectiva comparada</w:t>
+      </w:r>
+    </w:p>
+    <w:p>
+      <w:pPr>
+        <w:pStyle w:val="FirstParagraph"/>
+      </w:pPr>
+      <w:r>
+        <w:t xml:space="preserve">O Brasil está ausente da amostra principal por uma limitação de cobertura, e não por decisão analítica: o WDI reporta matrícula terciária para o país apenas a partir de 2012 (11 observações não nulas até 2022, abaixo do limiar de 20 exigido para compor o painel de 135 economias). Para situar o caso brasileiro, a Tabela 8 compara o Brasil com a renda média asiática (China, Indonésia, Malásia, Tailândia e Vietnã), os Estados Unidos, a Europa Ocidental (Alemanha, França, Reino Unido, Itália, Espanha e Portugal), a China e dois vizinhos latino-americanos de renda média (México e Argentina), todos na janela comum 2012–2022, com a mesma fonte WDI. A cobertura é desbalanceada — os Estados Unidos e a Alemanha iniciam a série em 2013 e Portugal em 2015 —, e o crescimento médio anual do PIB per capita é calculado sobre o número real de anos disponíveis em cada unidade, sem imputação.</w:t>
+      </w:r>
+    </w:p>
+    <w:tbl>
+      <w:tblPr>
+        <w:tblStyle w:val="Table"/>
+        <w:tblW w:type="pct" w:w="5000"/>
+        <w:tblLayout w:type="fixed"/>
+        <w:tblLook w:firstRow="1" w:lastRow="0" w:firstColumn="0" w:lastColumn="0" w:noHBand="0" w:noVBand="0" w:val="0020"/>
+      </w:tblPr>
+      <w:tblGrid>
+        <w:gridCol w:w="1584"/>
+        <w:gridCol w:w="1584"/>
+        <w:gridCol w:w="1584"/>
+        <w:gridCol w:w="1584"/>
+        <w:gridCol w:w="1584"/>
+      </w:tblGrid>
+      <w:tr>
+        <w:trPr>
+          <w:tblHeader w:val="on"/>
+        </w:trPr>
+        <w:tc>
+          <w:tcPr/>
+          <w:p>
+            <w:pPr>
+              <w:pStyle w:val="Compact"/>
+            </w:pPr>
+            <w:r>
               <w:t xml:space="preserve">Unidade</w:t>
             </w:r>
           </w:p>
@@ -4172,8 +4427,271 @@
       </w:r>
     </w:p>
     <w:bookmarkEnd w:id="26"/>
+    <w:bookmarkStart w:id="27" w:name="Xcc9187c024cdd0137d53f3c11d086abf7b90ff7"/>
+    <w:p>
+      <w:pPr>
+        <w:pStyle w:val="Heading3"/>
+      </w:pPr>
+      <w:r>
+        <w:t xml:space="preserve">4.10 Limites de detecção e equivalência do coeficiente de painel</w:t>
+      </w:r>
+    </w:p>
+    <w:p>
+      <w:pPr>
+        <w:pStyle w:val="FirstParagraph"/>
+      </w:pPr>
+      <w:r>
+        <w:t xml:space="preserve">A ausência de associação detectável na especificação de painel (0,073; IC95% −0,169 a 0,314) não é evidência de ausência de efeito: é necessário informar o tamanho do efeito que o desenho conseguiria detectar. Com o erro padrão clusterizado (0,062; n = 1.146; 106 clusters), o menor efeito detectável com poder de 80% e α de 5% bilateral é 0,173 no log da matrícula terciária (Tabela 13): um efeito genuíno de magnitude inferior a 0,17 não seria distinguível de zero neste desenho. Complementarmente, o teste de equivalência de dois unilaterais (TOST) com limites de ±0,10 e ±0,05 não permite declarar equivalência: p = 0,329 e p = 0,644, respectivamente — o coeficiente é compatível tanto com efeitos próximos de zero quanto com efeitos de magnitude relevante, e a leitura correta é de não-detecção, não de equivalência nem de efeito nulo.</w:t>
+      </w:r>
+    </w:p>
+    <w:tbl>
+      <w:tblPr>
+        <w:tblStyle w:val="Table"/>
+        <w:tblW w:type="auto" w:w="0"/>
+        <w:tblLook w:firstRow="1" w:lastRow="0" w:firstColumn="0" w:lastColumn="0" w:noHBand="0" w:noVBand="0" w:val="0020"/>
+      </w:tblPr>
+      <w:tblGrid>
+        <w:gridCol w:w="3960"/>
+        <w:gridCol w:w="3960"/>
+      </w:tblGrid>
+      <w:tr>
+        <w:trPr>
+          <w:tblHeader w:val="on"/>
+        </w:trPr>
+        <w:tc>
+          <w:tcPr/>
+          <w:p>
+            <w:pPr>
+              <w:pStyle w:val="Compact"/>
+            </w:pPr>
+            <w:r>
+              <w:t xml:space="preserve">Métrica</w:t>
+            </w:r>
+          </w:p>
+        </w:tc>
+        <w:tc>
+          <w:tcPr/>
+          <w:p>
+            <w:pPr>
+              <w:pStyle w:val="Compact"/>
+            </w:pPr>
+            <w:r>
+              <w:t xml:space="preserve">Valor</w:t>
+            </w:r>
+          </w:p>
+        </w:tc>
+      </w:tr>
+      <w:tr>
+        <w:tc>
+          <w:tcPr/>
+          <w:p>
+            <w:pPr>
+              <w:pStyle w:val="Compact"/>
+            </w:pPr>
+            <w:r>
+              <w:t xml:space="preserve">Coeficiente (log-PIB pc, lag 5)</w:t>
+            </w:r>
+          </w:p>
+        </w:tc>
+        <w:tc>
+          <w:tcPr/>
+          <w:p>
+            <w:pPr>
+              <w:pStyle w:val="Compact"/>
+            </w:pPr>
+            <w:r>
+              <w:t xml:space="preserve">0,073</w:t>
+            </w:r>
+          </w:p>
+        </w:tc>
+      </w:tr>
+      <w:tr>
+        <w:tc>
+          <w:tcPr/>
+          <w:p>
+            <w:pPr>
+              <w:pStyle w:val="Compact"/>
+            </w:pPr>
+            <w:r>
+              <w:t xml:space="preserve">Erro padrão clusterizado</w:t>
+            </w:r>
+          </w:p>
+        </w:tc>
+        <w:tc>
+          <w:tcPr/>
+          <w:p>
+            <w:pPr>
+              <w:pStyle w:val="Compact"/>
+            </w:pPr>
+            <w:r>
+              <w:t xml:space="preserve">0,062</w:t>
+            </w:r>
+          </w:p>
+        </w:tc>
+      </w:tr>
+      <w:tr>
+        <w:tc>
+          <w:tcPr/>
+          <w:p>
+            <w:pPr>
+              <w:pStyle w:val="Compact"/>
+            </w:pPr>
+            <w:r>
+              <w:t xml:space="preserve">IC95%</w:t>
+            </w:r>
+          </w:p>
+        </w:tc>
+        <w:tc>
+          <w:tcPr/>
+          <w:p>
+            <w:pPr>
+              <w:pStyle w:val="Compact"/>
+            </w:pPr>
+            <w:r>
+              <w:t xml:space="preserve">[−0,169; 0,314]</w:t>
+            </w:r>
+          </w:p>
+        </w:tc>
+      </w:tr>
+      <w:tr>
+        <w:tc>
+          <w:tcPr/>
+          <w:p>
+            <w:pPr>
+              <w:pStyle w:val="Compact"/>
+            </w:pPr>
+            <w:r>
+              <w:t xml:space="preserve">Menor efeito detectável (poder 80%, α 5%)</w:t>
+            </w:r>
+          </w:p>
+        </w:tc>
+        <w:tc>
+          <w:tcPr/>
+          <w:p>
+            <w:pPr>
+              <w:pStyle w:val="Compact"/>
+            </w:pPr>
+            <w:r>
+              <w:t xml:space="preserve">0,173</w:t>
+            </w:r>
+          </w:p>
+        </w:tc>
+      </w:tr>
+      <w:tr>
+        <w:tc>
+          <w:tcPr/>
+          <w:p>
+            <w:pPr>
+              <w:pStyle w:val="Compact"/>
+            </w:pPr>
+            <w:r>
+              <w:t xml:space="preserve">TOST ±0,10 (p)</w:t>
+            </w:r>
+          </w:p>
+        </w:tc>
+        <w:tc>
+          <w:tcPr/>
+          <w:p>
+            <w:pPr>
+              <w:pStyle w:val="Compact"/>
+            </w:pPr>
+            <w:r>
+              <w:t xml:space="preserve">0,329</w:t>
+            </w:r>
+          </w:p>
+        </w:tc>
+      </w:tr>
+      <w:tr>
+        <w:tc>
+          <w:tcPr/>
+          <w:p>
+            <w:pPr>
+              <w:pStyle w:val="Compact"/>
+            </w:pPr>
+            <w:r>
+              <w:t xml:space="preserve">TOST ±0,05 (p)</w:t>
+            </w:r>
+          </w:p>
+        </w:tc>
+        <w:tc>
+          <w:tcPr/>
+          <w:p>
+            <w:pPr>
+              <w:pStyle w:val="Compact"/>
+            </w:pPr>
+            <w:r>
+              <w:t xml:space="preserve">0,644</w:t>
+            </w:r>
+          </w:p>
+        </w:tc>
+      </w:tr>
+    </w:tbl>
+    <w:p>
+      <w:pPr>
+        <w:pStyle w:val="BodyText"/>
+      </w:pPr>
+      <w:r>
+        <w:rPr>
+          <w:i/>
+          <w:iCs/>
+        </w:rPr>
+        <w:t xml:space="preserve">Fonte: elaboração própria.</w:t>
+      </w:r>
+      <w:r>
+        <w:rPr>
+          <w:i/>
+          <w:iCs/>
+        </w:rPr>
+        <w:t xml:space="preserve"> </w:t>
+      </w:r>
+      <w:r>
+        <w:rPr>
+          <w:rStyle w:val="VerbatimChar"/>
+          <w:i/>
+          <w:iCs/>
+        </w:rPr>
+        <w:t xml:space="preserve">outputs/expanded/tabela13_tost_deteccao.csv</w:t>
+      </w:r>
+      <w:r>
+        <w:rPr>
+          <w:i/>
+          <w:iCs/>
+        </w:rPr>
+        <w:t xml:space="preserve"> </w:t>
+      </w:r>
+      <w:r>
+        <w:rPr>
+          <w:i/>
+          <w:iCs/>
+        </w:rPr>
+        <w:t xml:space="preserve">e</w:t>
+      </w:r>
+      <w:r>
+        <w:rPr>
+          <w:i/>
+          <w:iCs/>
+        </w:rPr>
+        <w:t xml:space="preserve"> </w:t>
+      </w:r>
+      <w:r>
+        <w:rPr>
+          <w:rStyle w:val="VerbatimChar"/>
+          <w:i/>
+          <w:iCs/>
+        </w:rPr>
+        <w:t xml:space="preserve">provenance_r423.json</w:t>
+      </w:r>
+      <w:r>
+        <w:rPr>
+          <w:i/>
+          <w:iCs/>
+        </w:rPr>
+        <w:t xml:space="preserve">. MDES = (z0,975 + z0,80) × SE; TOST de dois unilaterais sobre o log da matrícula terciária.</w:t>
+      </w:r>
+    </w:p>
     <w:bookmarkEnd w:id="27"/>
-    <w:bookmarkStart w:id="28" w:name="discussão"/>
+    <w:bookmarkEnd w:id="28"/>
+    <w:bookmarkStart w:id="29" w:name="discussão"/>
     <w:p>
       <w:pPr>
         <w:pStyle w:val="Heading2"/>
@@ -4222,8 +4740,8 @@
         <w:t xml:space="preserve">As principais limitações remanescentes do estudo são: (i) a seleção dos países é condicionada à disponibilidade de dados, e não aleatória; (ii) a cobertura das variáveis educacionais e de governança é parcial, sobretudo nas décadas iniciais; (iii) os indicadores WGI só existem a partir de 1996, o que restringe a amostra do painel com controles; e (iv) o caráter associativo de todas as estimativas — sem variação exógena, não é possível atribuir direção de relação. A replicabilidade integral dos resultados mitiga, mas não elimina, essas limitações.</w:t>
       </w:r>
     </w:p>
-    <w:bookmarkEnd w:id="28"/>
-    <w:bookmarkStart w:id="29" w:name="conclusão"/>
+    <w:bookmarkEnd w:id="29"/>
+    <w:bookmarkStart w:id="30" w:name="conclusão"/>
     <w:p>
       <w:pPr>
         <w:pStyle w:val="Heading2"/>
@@ -4248,8 +4766,8 @@
         <w:t xml:space="preserve">Para a política pública brasileira, o resultado mais defensável é o mais modesto: a expansão da educação terciária correlaciona-se positivamente com o nível de renda entre países, mas a magnitude dessa associação dentro do país é incerta e dependente de condições institucionais e de qualidade que este desenho não observa. A recomendação de priorizar a expansão do ensino superior com qualidade, governança e articulação com a inovação (ACEMOGLU; GALLEGO; ROBINSON, 2014; RODRIK, 2016; KAUFMANN; KRAAY; MASTRUZZI, 2011; WORLD BANK, 2024) é compatível com os resultados, mas não decorre deles como conclusão de associação.</w:t>
       </w:r>
     </w:p>
-    <w:bookmarkEnd w:id="29"/>
-    <w:bookmarkStart w:id="30" w:name="declarações"/>
+    <w:bookmarkEnd w:id="30"/>
+    <w:bookmarkStart w:id="31" w:name="declarações"/>
     <w:p>
       <w:pPr>
         <w:pStyle w:val="Heading2"/>
@@ -4303,8 +4821,8 @@
         <w:t xml:space="preserve">: todos os dados provêm de fontes oficiais públicas do Banco Mundial (World Development Indicators e Worldwide Governance Indicators), coletados com cache imutável e manifesto de integridade (SHA-256). O código, os scripts de análise e os artefatos de proveniência que sustentam cada número citado estão disponíveis em repositório público, permitindo a reprodução integral dos resultados.</w:t>
       </w:r>
     </w:p>
-    <w:bookmarkEnd w:id="30"/>
-    <w:bookmarkStart w:id="33" w:name="referências"/>
+    <w:bookmarkEnd w:id="31"/>
+    <w:bookmarkStart w:id="34" w:name="referências"/>
     <w:p>
       <w:pPr>
         <w:pStyle w:val="Heading2"/>
@@ -4483,7 +5001,7 @@
       <w:r>
         <w:t xml:space="preserve"> </w:t>
       </w:r>
-      <w:hyperlink r:id="rId31">
+      <w:hyperlink r:id="rId32">
         <w:r>
           <w:rPr>
             <w:rStyle w:val="Hyperlink"/>
@@ -4707,7 +5225,7 @@
       <w:r>
         <w:t xml:space="preserve"> </w:t>
       </w:r>
-      <w:hyperlink r:id="rId32">
+      <w:hyperlink r:id="rId33">
         <w:r>
           <w:rPr>
             <w:rStyle w:val="Hyperlink"/>
@@ -4719,8 +5237,8 @@
         <w:t xml:space="preserve">.</w:t>
       </w:r>
     </w:p>
-    <w:bookmarkEnd w:id="33"/>
-    <w:bookmarkStart w:id="37" w:name="X3274d0ba60d213e2c6009073b822d12d7337fba"/>
+    <w:bookmarkEnd w:id="34"/>
+    <w:bookmarkStart w:id="38" w:name="X3274d0ba60d213e2c6009073b822d12d7337fba"/>
     <w:p>
       <w:pPr>
         <w:pStyle w:val="Heading2"/>
@@ -4737,7 +5255,7 @@
         <w:t xml:space="preserve">Este apêndice consolida os símbolos estatísticos, os códigos oficiais dos indicadores e as siglas utilizadas no manuscrito, para facilitar a leitura. Todos os códigos referem-se ao World Development Indicators (WDI) e ao Worldwide Governance Indicators (WGI) do Banco Mundial.</w:t>
       </w:r>
     </w:p>
-    <w:bookmarkStart w:id="34" w:name="a.1-símbolos-estatísticos"/>
+    <w:bookmarkStart w:id="35" w:name="a.1-símbolos-estatísticos"/>
     <w:p>
       <w:pPr>
         <w:pStyle w:val="Heading3"/>
@@ -5121,8 +5639,8 @@
         </w:tc>
       </w:tr>
     </w:tbl>
-    <w:bookmarkEnd w:id="34"/>
-    <w:bookmarkStart w:id="35" w:name="a.2-códigos-de-indicadores-wdiwgi"/>
+    <w:bookmarkEnd w:id="35"/>
+    <w:bookmarkStart w:id="36" w:name="a.2-códigos-de-indicadores-wdiwgi"/>
     <w:p>
       <w:pPr>
         <w:pStyle w:val="Heading3"/>
@@ -5777,8 +6295,8 @@
         </w:tc>
       </w:tr>
     </w:tbl>
-    <w:bookmarkEnd w:id="35"/>
-    <w:bookmarkStart w:id="36" w:name="a.3-abreviaturas"/>
+    <w:bookmarkEnd w:id="36"/>
+    <w:bookmarkStart w:id="37" w:name="a.3-abreviaturas"/>
     <w:p>
       <w:pPr>
         <w:pStyle w:val="Heading3"/>
@@ -6186,9 +6704,9 @@
         </w:tc>
       </w:tr>
     </w:tbl>
-    <w:bookmarkEnd w:id="36"/>
     <w:bookmarkEnd w:id="37"/>
     <w:bookmarkEnd w:id="38"/>
+    <w:bookmarkEnd w:id="39"/>
     <w:sectPr>
       <w:footnotePr>
         <w:numRestart w:val="eachSect"/>

</xml_diff>

<commit_message>
feat(arm-education): autoria com ORCID no manuscrito e carta (R424)
- MD/TeX: "Autor: Marcelo Claro Laranjeira — ORCID 0000-0001-8996-2887"
  no cabeçalho trilíngue (com hyperlink no TeX)
- CARTA_AO_EDITOR.md: autor+ORCID no cabeçalho e assinatura; autoria no
  singular; corrigido overclaim "validações ... por tempo" → "análises de
  subperíodos" (paridade com R422)
- PDF recompilado (20p, 0 Overfull); DOCX regenerado
- Testes R410/R411: 3 novos; suíte R408-R424 com 369 passed
- EvolutionRegistry: R424 (242 ciclos); evo-55 documentado
</commit_message>
<xml_diff>
--- a/academic/papers/arm_education_audit/outputs/docx/ARTIGO_RBEP_SUBMISSAO.docx
+++ b/academic/papers/arm_education_audit/outputs/docx/ARTIGO_RBEP_SUBMISSAO.docx
@@ -89,6 +89,24 @@
       </w:r>
       <w:r>
         <w:t xml:space="preserve">Educación terciaria y trayectorias de ingreso: evidencia asociativa de panel con validación cruzada agrupada por país (135 economías, 1960–2023)</w:t>
+      </w:r>
+    </w:p>
+    <w:p>
+      <w:pPr>
+        <w:pStyle w:val="BodyText"/>
+      </w:pPr>
+      <w:r>
+        <w:rPr>
+          <w:b/>
+          <w:bCs/>
+        </w:rPr>
+        <w:t xml:space="preserve">Autor:</w:t>
+      </w:r>
+      <w:r>
+        <w:t xml:space="preserve"> </w:t>
+      </w:r>
+      <w:r>
+        <w:t xml:space="preserve">Marcelo Claro Laranjeira — ORCID: https://orcid.org/0000-0001-8996-2887</w:t>
       </w:r>
     </w:p>
     <w:p>

</xml_diff>